<commit_message>
Updated with VWFS UK detail
</commit_message>
<xml_diff>
--- a/CV_Charlie_Gunning.docx
+++ b/CV_Charlie_Gunning.docx
@@ -277,7 +277,7 @@
                 <v:stroke joinstyle="miter"/>
                 <v:path gradientshapeok="t" o:connecttype="rect"/>
               </v:shapetype>
-              <v:shape id="Text Box 1" o:spid="_x0000_s1026" type="#_x0000_t202" alt="&quot;&quot;" style="position:absolute;left:0;text-align:left;margin-left:14.25pt;margin-top:25.5pt;width:116.25pt;height:36pt;z-index:251659264;visibility:visible;mso-wrap-style:square;mso-width-percent:0;mso-height-percent:0;mso-wrap-distance-left:9pt;mso-wrap-distance-top:0;mso-wrap-distance-right:9pt;mso-wrap-distance-bottom:0;mso-position-horizontal:absolute;mso-position-horizontal-relative:left-margin-area;mso-position-vertical:absolute;mso-position-vertical-relative:top-margin-area;mso-width-percent:0;mso-height-percent:0;mso-width-relative:margin;mso-height-relative:margin;v-text-anchor:top" o:gfxdata="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" filled="f" stroked="f" strokeweight=".5pt">
+              <v:shape id="Text Box 1" o:spid="_x0000_s1026" type="#_x0000_t202" style="position:absolute;left:0;text-align:left;margin-left:14.25pt;margin-top:25.5pt;width:116.25pt;height:36pt;z-index:251659264;visibility:visible;mso-wrap-style:square;mso-width-percent:0;mso-height-percent:0;mso-wrap-distance-left:9pt;mso-wrap-distance-top:0;mso-wrap-distance-right:9pt;mso-wrap-distance-bottom:0;mso-position-horizontal:absolute;mso-position-horizontal-relative:left-margin-area;mso-position-vertical:absolute;mso-position-vertical-relative:top-margin-area;mso-width-percent:0;mso-height-percent:0;mso-width-relative:margin;mso-height-relative:margin;v-text-anchor:top" o:gfxdata="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" filled="f" stroked="f" strokeweight=".5pt">
                 <v:textbox>
                   <w:txbxContent>
                     <w:p>
@@ -591,7 +591,7 @@
               <w:rPr>
                 <w:color w:val="230400"/>
               </w:rPr>
-              <w:t>8</w:t>
+              <w:t>10</w:t>
             </w:r>
             <w:r>
               <w:rPr>
@@ -603,6 +603,12 @@
               <w:rPr>
                 <w:color w:val="230400"/>
               </w:rPr>
+              <w:t xml:space="preserve">data </w:t>
+            </w:r>
+            <w:r>
+              <w:rPr>
+                <w:color w:val="230400"/>
+              </w:rPr>
               <w:t>d</w:t>
             </w:r>
             <w:r>
@@ -615,25 +621,31 @@
               <w:rPr>
                 <w:color w:val="230400"/>
               </w:rPr>
-              <w:t xml:space="preserve">velopment experience, </w:t>
-            </w:r>
-            <w:r>
-              <w:rPr>
-                <w:color w:val="230400"/>
-              </w:rPr>
-              <w:t>lead</w:t>
-            </w:r>
-            <w:r>
-              <w:rPr>
-                <w:color w:val="230400"/>
-              </w:rPr>
-              <w:t>ing</w:t>
-            </w:r>
-            <w:r>
-              <w:rPr>
-                <w:color w:val="230400"/>
-              </w:rPr>
-              <w:t xml:space="preserve"> multiple key business projects </w:t>
+              <w:t>velopment experience</w:t>
+            </w:r>
+            <w:r>
+              <w:rPr>
+                <w:color w:val="230400"/>
+              </w:rPr>
+              <w:t>,</w:t>
+            </w:r>
+            <w:r>
+              <w:rPr>
+                <w:color w:val="230400"/>
+              </w:rPr>
+              <w:t xml:space="preserve"> </w:t>
+            </w:r>
+            <w:r>
+              <w:rPr>
+                <w:color w:val="230400"/>
+              </w:rPr>
+              <w:t>leading and delivering</w:t>
+            </w:r>
+            <w:r>
+              <w:rPr>
+                <w:color w:val="230400"/>
+              </w:rPr>
+              <w:t xml:space="preserve"> multiple key projects </w:t>
             </w:r>
             <w:r>
               <w:rPr>
@@ -657,7 +669,31 @@
               <w:rPr>
                 <w:color w:val="230400"/>
               </w:rPr>
-              <w:t xml:space="preserve"> with a practical approach to problem-solving and a drive to see deliverables through to completion. I am a </w:t>
+              <w:t xml:space="preserve"> </w:t>
+            </w:r>
+            <w:r>
+              <w:rPr>
+                <w:color w:val="230400"/>
+              </w:rPr>
+              <w:t>and</w:t>
+            </w:r>
+            <w:r>
+              <w:rPr>
+                <w:color w:val="230400"/>
+              </w:rPr>
+              <w:t xml:space="preserve"> a practical approach to problem-solving</w:t>
+            </w:r>
+            <w:r>
+              <w:rPr>
+                <w:color w:val="230400"/>
+              </w:rPr>
+              <w:t>.</w:t>
+            </w:r>
+            <w:r>
+              <w:rPr>
+                <w:color w:val="230400"/>
+              </w:rPr>
+              <w:t xml:space="preserve"> I am a </w:t>
             </w:r>
             <w:r>
               <w:rPr>
@@ -675,7 +711,25 @@
               <w:rPr>
                 <w:color w:val="230400"/>
               </w:rPr>
-              <w:t>, evidenced through my professional experience</w:t>
+              <w:t xml:space="preserve">, </w:t>
+            </w:r>
+            <w:r>
+              <w:rPr>
+                <w:color w:val="230400"/>
+              </w:rPr>
+              <w:t xml:space="preserve">which is </w:t>
+            </w:r>
+            <w:r>
+              <w:rPr>
+                <w:color w:val="230400"/>
+              </w:rPr>
+              <w:t xml:space="preserve">evidenced through my professional </w:t>
+            </w:r>
+            <w:r>
+              <w:rPr>
+                <w:color w:val="230400"/>
+              </w:rPr>
+              <w:t>career</w:t>
             </w:r>
             <w:r>
               <w:rPr>
@@ -699,7 +753,19 @@
               <w:rPr>
                 <w:color w:val="230400"/>
               </w:rPr>
-              <w:t xml:space="preserve"> with almost 10 years of experience</w:t>
+              <w:t xml:space="preserve"> with </w:t>
+            </w:r>
+            <w:r>
+              <w:rPr>
+                <w:color w:val="230400"/>
+              </w:rPr>
+              <w:t>over</w:t>
+            </w:r>
+            <w:r>
+              <w:rPr>
+                <w:color w:val="230400"/>
+              </w:rPr>
+              <w:t xml:space="preserve"> 10 years of experience</w:t>
             </w:r>
             <w:r>
               <w:rPr>
@@ -801,7 +867,7 @@
               <w:rPr>
                 <w:color w:val="230400"/>
               </w:rPr>
-              <w:t>PostgreSQL</w:t>
+              <w:t>PL/SQL</w:t>
             </w:r>
             <w:r>
               <w:rPr>
@@ -813,6 +879,12 @@
               <w:rPr>
                 <w:color w:val="230400"/>
               </w:rPr>
+              <w:t xml:space="preserve">PowerShell, </w:t>
+            </w:r>
+            <w:r>
+              <w:rPr>
+                <w:color w:val="230400"/>
+              </w:rPr>
               <w:t>C#</w:t>
             </w:r>
             <w:r>
@@ -838,6 +910,12 @@
                 <w:color w:val="230400"/>
               </w:rPr>
               <w:t>.</w:t>
+            </w:r>
+            <w:r>
+              <w:rPr>
+                <w:color w:val="230400"/>
+              </w:rPr>
+              <w:t xml:space="preserve"> Outside of work, I enjoy gaming, motorsports, riding, and travelling the world.</w:t>
             </w:r>
           </w:p>
         </w:tc>
@@ -1572,21 +1650,7 @@
                 <w:bCs/>
                 <w:color w:val="230400"/>
               </w:rPr>
-              <w:t>W</w:t>
-            </w:r>
-            <w:r>
-              <w:rPr>
-                <w:bCs/>
-                <w:color w:val="230400"/>
-              </w:rPr>
-              <w:t xml:space="preserve">eekly awards for taking ownership, great communication and supporting </w:t>
-            </w:r>
-            <w:r>
-              <w:rPr>
-                <w:bCs/>
-                <w:color w:val="230400"/>
-              </w:rPr>
-              <w:t>other teams in the business.</w:t>
+              <w:t>Supporting other functions of the business by running training sessions in SQL, Excel, and Version Control Systems.</w:t>
             </w:r>
           </w:p>
           <w:p>
@@ -1606,81 +1670,6 @@
                 <w:color w:val="230400"/>
               </w:rPr>
               <w:t>Quarterly awards for actively seeking cross-skilling opportunities, instilling a one-team ethos</w:t>
-            </w:r>
-            <w:r>
-              <w:rPr>
-                <w:bCs/>
-                <w:color w:val="230400"/>
-              </w:rPr>
-              <w:t>.</w:t>
-            </w:r>
-          </w:p>
-          <w:p>
-            <w:pPr>
-              <w:pStyle w:val="ListParagraph"/>
-              <w:numPr>
-                <w:ilvl w:val="0"/>
-                <w:numId w:val="3"/>
-              </w:numPr>
-              <w:rPr>
-                <w:color w:val="230400"/>
-              </w:rPr>
-            </w:pPr>
-            <w:r>
-              <w:rPr>
-                <w:bCs/>
-                <w:color w:val="230400"/>
-              </w:rPr>
-              <w:t>S</w:t>
-            </w:r>
-            <w:r>
-              <w:rPr>
-                <w:bCs/>
-                <w:color w:val="230400"/>
-              </w:rPr>
-              <w:t xml:space="preserve">upporting other </w:t>
-            </w:r>
-            <w:r>
-              <w:rPr>
-                <w:bCs/>
-                <w:color w:val="230400"/>
-              </w:rPr>
-              <w:t>functions of the business</w:t>
-            </w:r>
-            <w:r>
-              <w:rPr>
-                <w:bCs/>
-                <w:color w:val="230400"/>
-              </w:rPr>
-              <w:t xml:space="preserve"> by </w:t>
-            </w:r>
-            <w:r>
-              <w:rPr>
-                <w:bCs/>
-                <w:color w:val="230400"/>
-              </w:rPr>
-              <w:t>running</w:t>
-            </w:r>
-            <w:r>
-              <w:rPr>
-                <w:bCs/>
-                <w:color w:val="230400"/>
-              </w:rPr>
-              <w:t xml:space="preserve"> training </w:t>
-            </w:r>
-            <w:r>
-              <w:rPr>
-                <w:bCs/>
-                <w:color w:val="230400"/>
-              </w:rPr>
-              <w:t>sessions</w:t>
-            </w:r>
-            <w:r>
-              <w:rPr>
-                <w:bCs/>
-                <w:color w:val="230400"/>
-              </w:rPr>
-              <w:t xml:space="preserve"> in SQL, Excel, and Version Control Systems</w:t>
             </w:r>
             <w:r>
               <w:rPr>
@@ -1835,7 +1824,7 @@
                 <w:b/>
                 <w:color w:val="230400"/>
               </w:rPr>
-              <w:t>ORACLE RED BULL RACING</w:t>
+              <w:t>VOLKSWAGEN FINANCIAL SERVICES (UK)</w:t>
             </w:r>
           </w:p>
         </w:tc>
@@ -1855,7 +1844,19 @@
               <w:rPr>
                 <w:color w:val="230400"/>
               </w:rPr>
-              <w:t>Apr 2022</w:t>
+              <w:t>Jan</w:t>
+            </w:r>
+            <w:r>
+              <w:rPr>
+                <w:color w:val="230400"/>
+              </w:rPr>
+              <w:t xml:space="preserve"> 202</w:t>
+            </w:r>
+            <w:r>
+              <w:rPr>
+                <w:color w:val="230400"/>
+              </w:rPr>
+              <w:t>6</w:t>
             </w:r>
             <w:r>
               <w:rPr>
@@ -1879,7 +1880,7 @@
               <w:rPr>
                 <w:color w:val="230400"/>
               </w:rPr>
-              <w:t>Sep 2025</w:t>
+              <w:t>Present</w:t>
             </w:r>
           </w:p>
         </w:tc>
@@ -1904,6 +1905,235 @@
               <w:rPr>
                 <w:color w:val="230400"/>
               </w:rPr>
+              <w:t>Lead Data Platform Engineer</w:t>
+            </w:r>
+            <w:r>
+              <w:rPr>
+                <w:color w:val="230400"/>
+              </w:rPr>
+              <w:br/>
+            </w:r>
+          </w:p>
+          <w:p>
+            <w:pPr>
+              <w:pStyle w:val="ListParagraph"/>
+              <w:numPr>
+                <w:ilvl w:val="0"/>
+                <w:numId w:val="3"/>
+              </w:numPr>
+              <w:rPr>
+                <w:color w:val="230400"/>
+              </w:rPr>
+            </w:pPr>
+            <w:r>
+              <w:rPr>
+                <w:color w:val="230400"/>
+              </w:rPr>
+              <w:t>Technical Application Manager for VWFS UK’s Data Platform.</w:t>
+            </w:r>
+          </w:p>
+          <w:p>
+            <w:pPr>
+              <w:pStyle w:val="ListParagraph"/>
+              <w:numPr>
+                <w:ilvl w:val="0"/>
+                <w:numId w:val="3"/>
+              </w:numPr>
+              <w:rPr>
+                <w:color w:val="230400"/>
+              </w:rPr>
+            </w:pPr>
+            <w:r>
+              <w:rPr>
+                <w:color w:val="230400"/>
+              </w:rPr>
+              <w:t>Primary technical consultant for Data Platform’s current estate and future roadmap.</w:t>
+            </w:r>
+          </w:p>
+          <w:p>
+            <w:pPr>
+              <w:pStyle w:val="ListParagraph"/>
+              <w:numPr>
+                <w:ilvl w:val="0"/>
+                <w:numId w:val="3"/>
+              </w:numPr>
+              <w:rPr>
+                <w:color w:val="230400"/>
+              </w:rPr>
+            </w:pPr>
+            <w:r>
+              <w:rPr>
+                <w:color w:val="230400"/>
+              </w:rPr>
+              <w:t>Defining and leading working relationship with VWFS UK’s external consultancy firm.</w:t>
+            </w:r>
+          </w:p>
+          <w:p>
+            <w:pPr>
+              <w:pStyle w:val="ListParagraph"/>
+              <w:numPr>
+                <w:ilvl w:val="0"/>
+                <w:numId w:val="3"/>
+              </w:numPr>
+              <w:rPr>
+                <w:color w:val="230400"/>
+              </w:rPr>
+            </w:pPr>
+            <w:r>
+              <w:rPr>
+                <w:color w:val="230400"/>
+              </w:rPr>
+              <w:t>Creating roadmaps for Data Platform patching/upgrades/migration work.</w:t>
+            </w:r>
+          </w:p>
+          <w:p>
+            <w:pPr>
+              <w:pStyle w:val="ListParagraph"/>
+              <w:numPr>
+                <w:ilvl w:val="0"/>
+                <w:numId w:val="3"/>
+              </w:numPr>
+              <w:rPr>
+                <w:color w:val="230400"/>
+              </w:rPr>
+            </w:pPr>
+            <w:r>
+              <w:rPr>
+                <w:color w:val="230400"/>
+              </w:rPr>
+              <w:t>Building a bespoke environment data refresh solution for VWFS UK from scratch.</w:t>
+            </w:r>
+          </w:p>
+          <w:p>
+            <w:pPr>
+              <w:pStyle w:val="ListParagraph"/>
+              <w:numPr>
+                <w:ilvl w:val="0"/>
+                <w:numId w:val="3"/>
+              </w:numPr>
+              <w:rPr>
+                <w:color w:val="230400"/>
+              </w:rPr>
+            </w:pPr>
+            <w:r>
+              <w:rPr>
+                <w:color w:val="230400"/>
+              </w:rPr>
+              <w:t>Delivered security compliance goals for Production environment within 3 months of starting.</w:t>
+            </w:r>
+          </w:p>
+        </w:tc>
+      </w:tr>
+      <w:tr>
+        <w:trPr>
+          <w:trHeight w:val="340"/>
+        </w:trPr>
+        <w:tc>
+          <w:tcPr>
+            <w:tcW w:w="10988" w:type="dxa"/>
+            <w:gridSpan w:val="2"/>
+            <w:vAlign w:val="center"/>
+          </w:tcPr>
+          <w:p>
+            <w:pPr>
+              <w:rPr>
+                <w:color w:val="230400"/>
+              </w:rPr>
+            </w:pPr>
+          </w:p>
+        </w:tc>
+      </w:tr>
+      <w:tr>
+        <w:trPr>
+          <w:trHeight w:val="340"/>
+        </w:trPr>
+        <w:tc>
+          <w:tcPr>
+            <w:tcW w:w="5494" w:type="dxa"/>
+            <w:vAlign w:val="center"/>
+          </w:tcPr>
+          <w:p>
+            <w:pPr>
+              <w:rPr>
+                <w:b/>
+                <w:color w:val="230400"/>
+              </w:rPr>
+            </w:pPr>
+            <w:bookmarkStart w:id="0" w:name="_Hlk219472280"/>
+            <w:r>
+              <w:rPr>
+                <w:b/>
+                <w:color w:val="230400"/>
+              </w:rPr>
+              <w:t>ORACLE RED BULL RACING</w:t>
+            </w:r>
+          </w:p>
+        </w:tc>
+        <w:tc>
+          <w:tcPr>
+            <w:tcW w:w="5494" w:type="dxa"/>
+            <w:vAlign w:val="center"/>
+          </w:tcPr>
+          <w:p>
+            <w:pPr>
+              <w:jc w:val="right"/>
+              <w:rPr>
+                <w:color w:val="230400"/>
+              </w:rPr>
+            </w:pPr>
+            <w:r>
+              <w:rPr>
+                <w:color w:val="230400"/>
+              </w:rPr>
+              <w:t>Apr 2022</w:t>
+            </w:r>
+            <w:r>
+              <w:rPr>
+                <w:color w:val="230400"/>
+              </w:rPr>
+              <w:t xml:space="preserve"> </w:t>
+            </w:r>
+            <w:r>
+              <w:rPr>
+                <w:color w:val="230400"/>
+              </w:rPr>
+              <w:t>–</w:t>
+            </w:r>
+            <w:r>
+              <w:rPr>
+                <w:color w:val="230400"/>
+              </w:rPr>
+              <w:t xml:space="preserve"> </w:t>
+            </w:r>
+            <w:r>
+              <w:rPr>
+                <w:color w:val="230400"/>
+              </w:rPr>
+              <w:t>Sep 2025</w:t>
+            </w:r>
+          </w:p>
+        </w:tc>
+      </w:tr>
+      <w:tr>
+        <w:trPr>
+          <w:trHeight w:val="416"/>
+        </w:trPr>
+        <w:tc>
+          <w:tcPr>
+            <w:tcW w:w="10988" w:type="dxa"/>
+            <w:gridSpan w:val="2"/>
+            <w:vAlign w:val="center"/>
+          </w:tcPr>
+          <w:p>
+            <w:pPr>
+              <w:rPr>
+                <w:color w:val="230400"/>
+              </w:rPr>
+            </w:pPr>
+            <w:r>
+              <w:rPr>
+                <w:color w:val="230400"/>
+              </w:rPr>
               <w:t xml:space="preserve">SQL </w:t>
             </w:r>
             <w:r>
@@ -2108,6 +2338,7 @@
               <w:rPr>
                 <w:color w:val="230400"/>
               </w:rPr>
+              <w:lastRenderedPageBreak/>
               <w:t xml:space="preserve">Planning and upgrading SQL Server estate to latest patches and/or migrating instances/databases to newer versions, to </w:t>
             </w:r>
             <w:r>
@@ -2150,7 +2381,7 @@
               <w:rPr>
                 <w:color w:val="230400"/>
               </w:rPr>
-              <w:t>Providing reporting solutions through Power BI and SSRS. Also maintaining and upgrading the Report Servers.</w:t>
+              <w:t>Analysing usage of our SQL Server estate and calculating licensing costs for annual Microsoft True-up submission.</w:t>
             </w:r>
           </w:p>
           <w:p>
@@ -2168,31 +2399,214 @@
               <w:rPr>
                 <w:color w:val="230400"/>
               </w:rPr>
-              <w:t xml:space="preserve">Leading upgrade and migration work on Red Bull Racing's code store and </w:t>
-            </w:r>
-            <w:r>
-              <w:rPr>
-                <w:color w:val="230400"/>
-              </w:rPr>
-              <w:t>Application Lifecycle Management (</w:t>
-            </w:r>
-            <w:r>
-              <w:rPr>
-                <w:color w:val="230400"/>
-              </w:rPr>
-              <w:t>ALM</w:t>
-            </w:r>
-            <w:r>
-              <w:rPr>
-                <w:color w:val="230400"/>
-              </w:rPr>
-              <w:t>)</w:t>
-            </w:r>
-            <w:r>
-              <w:rPr>
-                <w:color w:val="230400"/>
-              </w:rPr>
-              <w:t xml:space="preserve"> platform (Azure DevOps Server).</w:t>
+              <w:t xml:space="preserve">Sole developer of </w:t>
+            </w:r>
+            <w:proofErr w:type="spellStart"/>
+            <w:r>
+              <w:rPr>
+                <w:color w:val="230400"/>
+              </w:rPr>
+              <w:t>SQLServerMetadata</w:t>
+            </w:r>
+            <w:proofErr w:type="spellEnd"/>
+            <w:r>
+              <w:rPr>
+                <w:color w:val="230400"/>
+              </w:rPr>
+              <w:t xml:space="preserve">, a self-built discovery tool used to capture the business' SQL estate, including information on machines, instances, and databases. The tool assists with patching requirements, capacity </w:t>
+            </w:r>
+            <w:r>
+              <w:rPr>
+                <w:color w:val="230400"/>
+              </w:rPr>
+              <w:t>planning</w:t>
+            </w:r>
+            <w:r>
+              <w:rPr>
+                <w:color w:val="230400"/>
+              </w:rPr>
+              <w:t xml:space="preserve"> </w:t>
+            </w:r>
+            <w:r>
+              <w:rPr>
+                <w:color w:val="230400"/>
+              </w:rPr>
+              <w:t>at</w:t>
+            </w:r>
+            <w:r>
+              <w:rPr>
+                <w:color w:val="230400"/>
+              </w:rPr>
+              <w:t xml:space="preserve"> </w:t>
+            </w:r>
+            <w:r>
+              <w:rPr>
+                <w:color w:val="230400"/>
+              </w:rPr>
+              <w:t xml:space="preserve">a </w:t>
+            </w:r>
+            <w:r>
+              <w:rPr>
+                <w:color w:val="230400"/>
+              </w:rPr>
+              <w:t>database-level to track growth</w:t>
+            </w:r>
+            <w:r>
+              <w:rPr>
+                <w:color w:val="230400"/>
+              </w:rPr>
+              <w:t xml:space="preserve"> and</w:t>
+            </w:r>
+            <w:r>
+              <w:rPr>
+                <w:color w:val="230400"/>
+              </w:rPr>
+              <w:t xml:space="preserve"> captur</w:t>
+            </w:r>
+            <w:r>
+              <w:rPr>
+                <w:color w:val="230400"/>
+              </w:rPr>
+              <w:t>ing</w:t>
+            </w:r>
+            <w:r>
+              <w:rPr>
+                <w:color w:val="230400"/>
+              </w:rPr>
+              <w:t xml:space="preserve"> other</w:t>
+            </w:r>
+            <w:r>
+              <w:rPr>
+                <w:color w:val="230400"/>
+              </w:rPr>
+              <w:t xml:space="preserve"> </w:t>
+            </w:r>
+            <w:r>
+              <w:rPr>
+                <w:color w:val="230400"/>
+              </w:rPr>
+              <w:t>information such as business owners and purpose.</w:t>
+            </w:r>
+          </w:p>
+        </w:tc>
+      </w:tr>
+      <w:tr>
+        <w:trPr>
+          <w:trHeight w:val="340"/>
+        </w:trPr>
+        <w:tc>
+          <w:tcPr>
+            <w:tcW w:w="10988" w:type="dxa"/>
+            <w:gridSpan w:val="2"/>
+            <w:vAlign w:val="center"/>
+          </w:tcPr>
+          <w:p>
+            <w:pPr>
+              <w:rPr>
+                <w:color w:val="230400"/>
+              </w:rPr>
+            </w:pPr>
+            <w:bookmarkStart w:id="1" w:name="_Hlk165554510"/>
+          </w:p>
+        </w:tc>
+      </w:tr>
+      <w:tr>
+        <w:trPr>
+          <w:trHeight w:val="340"/>
+        </w:trPr>
+        <w:tc>
+          <w:tcPr>
+            <w:tcW w:w="5494" w:type="dxa"/>
+            <w:vAlign w:val="center"/>
+          </w:tcPr>
+          <w:p>
+            <w:pPr>
+              <w:rPr>
+                <w:b/>
+                <w:color w:val="230400"/>
+              </w:rPr>
+            </w:pPr>
+            <w:r>
+              <w:rPr>
+                <w:b/>
+                <w:color w:val="230400"/>
+              </w:rPr>
+              <w:t>BARCLAYS PLC</w:t>
+            </w:r>
+          </w:p>
+        </w:tc>
+        <w:tc>
+          <w:tcPr>
+            <w:tcW w:w="5494" w:type="dxa"/>
+            <w:vAlign w:val="center"/>
+          </w:tcPr>
+          <w:p>
+            <w:pPr>
+              <w:jc w:val="right"/>
+              <w:rPr>
+                <w:color w:val="230400"/>
+              </w:rPr>
+            </w:pPr>
+            <w:r>
+              <w:rPr>
+                <w:color w:val="230400"/>
+              </w:rPr>
+              <w:t>Apr 2021</w:t>
+            </w:r>
+            <w:r>
+              <w:rPr>
+                <w:color w:val="230400"/>
+              </w:rPr>
+              <w:t xml:space="preserve"> </w:t>
+            </w:r>
+            <w:r>
+              <w:rPr>
+                <w:color w:val="230400"/>
+              </w:rPr>
+              <w:t>–</w:t>
+            </w:r>
+            <w:r>
+              <w:rPr>
+                <w:color w:val="230400"/>
+              </w:rPr>
+              <w:t xml:space="preserve"> </w:t>
+            </w:r>
+            <w:r>
+              <w:rPr>
+                <w:color w:val="230400"/>
+              </w:rPr>
+              <w:t>Apr 2022</w:t>
+            </w:r>
+          </w:p>
+        </w:tc>
+      </w:tr>
+      <w:tr>
+        <w:trPr>
+          <w:trHeight w:val="1418"/>
+        </w:trPr>
+        <w:tc>
+          <w:tcPr>
+            <w:tcW w:w="10988" w:type="dxa"/>
+            <w:gridSpan w:val="2"/>
+            <w:vAlign w:val="center"/>
+          </w:tcPr>
+          <w:p>
+            <w:pPr>
+              <w:rPr>
+                <w:color w:val="230400"/>
+              </w:rPr>
+            </w:pPr>
+            <w:r>
+              <w:rPr>
+                <w:color w:val="230400"/>
+              </w:rPr>
+              <w:t>SQL Developer</w:t>
+            </w:r>
+            <w:r>
+              <w:rPr>
+                <w:color w:val="230400"/>
+              </w:rPr>
+              <w:br/>
             </w:r>
           </w:p>
           <w:p>
@@ -2210,7 +2624,37 @@
               <w:rPr>
                 <w:color w:val="230400"/>
               </w:rPr>
-              <w:t>Analysing usage of our SQL Server estate and calculating licensing costs for annual Microsoft True-up submission.</w:t>
+              <w:t>Co-leading d</w:t>
+            </w:r>
+            <w:r>
+              <w:rPr>
+                <w:color w:val="230400"/>
+              </w:rPr>
+              <w:t>esign, implementation and maintenance of the business'</w:t>
+            </w:r>
+            <w:r>
+              <w:rPr>
+                <w:color w:val="230400"/>
+              </w:rPr>
+              <w:t>s</w:t>
+            </w:r>
+            <w:r>
+              <w:rPr>
+                <w:color w:val="230400"/>
+              </w:rPr>
+              <w:t xml:space="preserve"> </w:t>
+            </w:r>
+            <w:r>
+              <w:rPr>
+                <w:color w:val="230400"/>
+              </w:rPr>
+              <w:t>project and resource management tool</w:t>
+            </w:r>
+            <w:r>
+              <w:rPr>
+                <w:color w:val="230400"/>
+              </w:rPr>
+              <w:t>.</w:t>
             </w:r>
           </w:p>
           <w:p>
@@ -2228,97 +2672,61 @@
               <w:rPr>
                 <w:color w:val="230400"/>
               </w:rPr>
-              <w:t xml:space="preserve">Sole developer of SQLServerMetadata, a self-built discovery tool used to capture the business' SQL estate, including information on machines, instances, and databases. The tool assists with patching requirements, capacity </w:t>
-            </w:r>
-            <w:r>
-              <w:rPr>
-                <w:color w:val="230400"/>
-              </w:rPr>
-              <w:t>planning</w:t>
-            </w:r>
-            <w:r>
-              <w:rPr>
-                <w:color w:val="230400"/>
-              </w:rPr>
-              <w:t xml:space="preserve"> </w:t>
-            </w:r>
-            <w:r>
-              <w:rPr>
-                <w:color w:val="230400"/>
-              </w:rPr>
-              <w:t>at</w:t>
-            </w:r>
-            <w:r>
-              <w:rPr>
-                <w:color w:val="230400"/>
-              </w:rPr>
-              <w:t xml:space="preserve"> </w:t>
-            </w:r>
-            <w:r>
-              <w:rPr>
-                <w:color w:val="230400"/>
-              </w:rPr>
-              <w:t xml:space="preserve">a </w:t>
-            </w:r>
-            <w:r>
-              <w:rPr>
-                <w:color w:val="230400"/>
-              </w:rPr>
-              <w:t xml:space="preserve">database-level to track </w:t>
-            </w:r>
-            <w:r>
-              <w:rPr>
-                <w:color w:val="230400"/>
-              </w:rPr>
-              <w:t>growth</w:t>
-            </w:r>
-            <w:r>
-              <w:rPr>
-                <w:color w:val="230400"/>
-              </w:rPr>
-              <w:t xml:space="preserve"> and</w:t>
-            </w:r>
-            <w:r>
-              <w:rPr>
-                <w:color w:val="230400"/>
-              </w:rPr>
-              <w:t xml:space="preserve"> captur</w:t>
-            </w:r>
-            <w:r>
-              <w:rPr>
-                <w:color w:val="230400"/>
-              </w:rPr>
-              <w:t>ing</w:t>
-            </w:r>
-            <w:r>
-              <w:rPr>
-                <w:color w:val="230400"/>
-              </w:rPr>
-              <w:t xml:space="preserve"> other</w:t>
-            </w:r>
-            <w:r>
-              <w:rPr>
-                <w:color w:val="230400"/>
-              </w:rPr>
-              <w:t xml:space="preserve"> </w:t>
-            </w:r>
-            <w:r>
-              <w:rPr>
-                <w:color w:val="230400"/>
-              </w:rPr>
-              <w:t xml:space="preserve">information such as </w:t>
-            </w:r>
-            <w:r>
-              <w:rPr>
-                <w:color w:val="230400"/>
-              </w:rPr>
-              <w:t xml:space="preserve">business </w:t>
-            </w:r>
-            <w:r>
-              <w:rPr>
-                <w:color w:val="230400"/>
-              </w:rPr>
-              <w:t>owners and purpose.</w:t>
+              <w:t>Lead developer on relational database design and future considerations for the above platform.</w:t>
+            </w:r>
+          </w:p>
+          <w:p>
+            <w:pPr>
+              <w:pStyle w:val="ListParagraph"/>
+              <w:numPr>
+                <w:ilvl w:val="0"/>
+                <w:numId w:val="1"/>
+              </w:numPr>
+              <w:rPr>
+                <w:color w:val="230400"/>
+              </w:rPr>
+            </w:pPr>
+            <w:r>
+              <w:rPr>
+                <w:color w:val="230400"/>
+              </w:rPr>
+              <w:t>Lead developer on merging and reconciliation of data from multiple resource systems.</w:t>
+            </w:r>
+          </w:p>
+          <w:p>
+            <w:pPr>
+              <w:pStyle w:val="ListParagraph"/>
+              <w:numPr>
+                <w:ilvl w:val="0"/>
+                <w:numId w:val="1"/>
+              </w:numPr>
+              <w:rPr>
+                <w:color w:val="230400"/>
+              </w:rPr>
+            </w:pPr>
+            <w:r>
+              <w:rPr>
+                <w:color w:val="230400"/>
+              </w:rPr>
+              <w:t>Lead developer on migrating the platform from a VBA front-end to a web-based front-end.</w:t>
+            </w:r>
+          </w:p>
+          <w:p>
+            <w:pPr>
+              <w:pStyle w:val="ListParagraph"/>
+              <w:numPr>
+                <w:ilvl w:val="0"/>
+                <w:numId w:val="1"/>
+              </w:numPr>
+              <w:rPr>
+                <w:color w:val="230400"/>
+              </w:rPr>
+            </w:pPr>
+            <w:r>
+              <w:rPr>
+                <w:color w:val="230400"/>
+              </w:rPr>
+              <w:t>Lead on integration of a Version Control System (Bitbucket) into the team’s processes.</w:t>
             </w:r>
           </w:p>
         </w:tc>
@@ -2342,6 +2750,8 @@
           </w:p>
         </w:tc>
       </w:tr>
+      <w:bookmarkEnd w:id="0"/>
+      <w:bookmarkEnd w:id="1"/>
       <w:tr>
         <w:trPr>
           <w:trHeight w:val="340"/>
@@ -2363,15 +2773,21 @@
                 <w:b/>
                 <w:color w:val="230400"/>
               </w:rPr>
-              <w:lastRenderedPageBreak/>
-              <w:t>BARCLAYS</w:t>
+              <w:t xml:space="preserve">WILMINGTON </w:t>
             </w:r>
             <w:r>
               <w:rPr>
                 <w:b/>
                 <w:color w:val="230400"/>
               </w:rPr>
-              <w:t xml:space="preserve"> PLC</w:t>
+              <w:t>PLC</w:t>
+            </w:r>
+            <w:r>
+              <w:rPr>
+                <w:b/>
+                <w:color w:val="230400"/>
+              </w:rPr>
+              <w:t xml:space="preserve"> (HEALTHCARE)</w:t>
             </w:r>
           </w:p>
         </w:tc>
@@ -2391,7 +2807,19 @@
               <w:rPr>
                 <w:color w:val="230400"/>
               </w:rPr>
-              <w:t>Apr 2021</w:t>
+              <w:t>Jul</w:t>
+            </w:r>
+            <w:r>
+              <w:rPr>
+                <w:color w:val="230400"/>
+              </w:rPr>
+              <w:t xml:space="preserve"> 2019 </w:t>
+            </w:r>
+            <w:r>
+              <w:rPr>
+                <w:color w:val="230400"/>
+              </w:rPr>
+              <w:t>–</w:t>
             </w:r>
             <w:r>
               <w:rPr>
@@ -2403,26 +2831,14 @@
               <w:rPr>
                 <w:color w:val="230400"/>
               </w:rPr>
-              <w:t>–</w:t>
-            </w:r>
-            <w:r>
-              <w:rPr>
-                <w:color w:val="230400"/>
-              </w:rPr>
-              <w:t xml:space="preserve"> </w:t>
-            </w:r>
-            <w:r>
-              <w:rPr>
-                <w:color w:val="230400"/>
-              </w:rPr>
-              <w:t>Apr 2022</w:t>
+              <w:t>Mar 2021</w:t>
             </w:r>
           </w:p>
         </w:tc>
       </w:tr>
       <w:tr>
         <w:trPr>
-          <w:trHeight w:val="1418"/>
+          <w:trHeight w:val="340"/>
         </w:trPr>
         <w:tc>
           <w:tcPr>
@@ -2436,7 +2852,6 @@
                 <w:color w:val="230400"/>
               </w:rPr>
             </w:pPr>
-            <w:bookmarkStart w:id="0" w:name="_Hlk165554492"/>
             <w:r>
               <w:rPr>
                 <w:color w:val="230400"/>
@@ -2471,7 +2886,19 @@
               <w:rPr>
                 <w:color w:val="230400"/>
               </w:rPr>
-              <w:t>esign, implementation and maintenance of the business'</w:t>
+              <w:t xml:space="preserve">esign, </w:t>
+            </w:r>
+            <w:r>
+              <w:rPr>
+                <w:color w:val="230400"/>
+              </w:rPr>
+              <w:t>implementation,</w:t>
+            </w:r>
+            <w:r>
+              <w:rPr>
+                <w:color w:val="230400"/>
+              </w:rPr>
+              <w:t xml:space="preserve"> and maintenance of the business'</w:t>
             </w:r>
             <w:r>
               <w:rPr>
@@ -2489,7 +2916,19 @@
               <w:rPr>
                 <w:color w:val="230400"/>
               </w:rPr>
-              <w:t>project and resource management tool</w:t>
+              <w:t xml:space="preserve">healthcare </w:t>
+            </w:r>
+            <w:r>
+              <w:rPr>
+                <w:color w:val="230400"/>
+              </w:rPr>
+              <w:t>data</w:t>
+            </w:r>
+            <w:r>
+              <w:rPr>
+                <w:color w:val="230400"/>
+              </w:rPr>
+              <w:t xml:space="preserve"> platform</w:t>
             </w:r>
             <w:r>
               <w:rPr>
@@ -2513,43 +2952,31 @@
               <w:rPr>
                 <w:color w:val="230400"/>
               </w:rPr>
-              <w:t>Lead</w:t>
-            </w:r>
-            <w:r>
-              <w:rPr>
-                <w:color w:val="230400"/>
-              </w:rPr>
-              <w:t xml:space="preserve"> developer on</w:t>
-            </w:r>
-            <w:r>
-              <w:rPr>
-                <w:color w:val="230400"/>
-              </w:rPr>
-              <w:t xml:space="preserve"> relational database design</w:t>
-            </w:r>
-            <w:r>
-              <w:rPr>
-                <w:color w:val="230400"/>
-              </w:rPr>
-              <w:t xml:space="preserve"> and future considerations</w:t>
-            </w:r>
-            <w:r>
-              <w:rPr>
-                <w:color w:val="230400"/>
-              </w:rPr>
-              <w:t xml:space="preserve"> for the above </w:t>
-            </w:r>
-            <w:r>
-              <w:rPr>
-                <w:color w:val="230400"/>
-              </w:rPr>
-              <w:t>platform</w:t>
-            </w:r>
-            <w:r>
-              <w:rPr>
-                <w:color w:val="230400"/>
-              </w:rPr>
-              <w:t>.</w:t>
+              <w:t>Supporting the above by using tools and software</w:t>
+            </w:r>
+            <w:r>
+              <w:rPr>
+                <w:color w:val="230400"/>
+              </w:rPr>
+              <w:t>,</w:t>
+            </w:r>
+            <w:r>
+              <w:rPr>
+                <w:color w:val="230400"/>
+              </w:rPr>
+              <w:t xml:space="preserve"> including Tableau, Git, </w:t>
+            </w:r>
+            <w:r>
+              <w:rPr>
+                <w:color w:val="230400"/>
+              </w:rPr>
+              <w:t>GitHub,</w:t>
+            </w:r>
+            <w:r>
+              <w:rPr>
+                <w:color w:val="230400"/>
+              </w:rPr>
+              <w:t xml:space="preserve"> and Visual Studio Code.</w:t>
             </w:r>
           </w:p>
           <w:p>
@@ -2567,115 +2994,73 @@
               <w:rPr>
                 <w:color w:val="230400"/>
               </w:rPr>
-              <w:t>Lead developer on merging and reconciliation of data from multiple resource systems.</w:t>
-            </w:r>
-          </w:p>
-          <w:p>
-            <w:pPr>
-              <w:pStyle w:val="ListParagraph"/>
-              <w:numPr>
-                <w:ilvl w:val="0"/>
-                <w:numId w:val="1"/>
-              </w:numPr>
-              <w:rPr>
-                <w:color w:val="230400"/>
-              </w:rPr>
-            </w:pPr>
-            <w:r>
-              <w:rPr>
-                <w:color w:val="230400"/>
-              </w:rPr>
-              <w:t xml:space="preserve">Lead developer on migrating </w:t>
-            </w:r>
-            <w:r>
-              <w:rPr>
-                <w:color w:val="230400"/>
-              </w:rPr>
-              <w:t>the platform</w:t>
-            </w:r>
-            <w:r>
-              <w:rPr>
-                <w:color w:val="230400"/>
-              </w:rPr>
-              <w:t xml:space="preserve"> from </w:t>
-            </w:r>
-            <w:r>
-              <w:rPr>
-                <w:color w:val="230400"/>
-              </w:rPr>
-              <w:t xml:space="preserve">a </w:t>
-            </w:r>
-            <w:r>
-              <w:rPr>
-                <w:color w:val="230400"/>
-              </w:rPr>
-              <w:t>VBA</w:t>
-            </w:r>
-            <w:r>
-              <w:rPr>
-                <w:color w:val="230400"/>
-              </w:rPr>
-              <w:t xml:space="preserve"> front-end</w:t>
-            </w:r>
-            <w:r>
-              <w:rPr>
-                <w:color w:val="230400"/>
-              </w:rPr>
-              <w:t xml:space="preserve"> to</w:t>
-            </w:r>
-            <w:r>
-              <w:rPr>
-                <w:color w:val="230400"/>
-              </w:rPr>
-              <w:t xml:space="preserve"> a</w:t>
-            </w:r>
-            <w:r>
-              <w:rPr>
-                <w:color w:val="230400"/>
-              </w:rPr>
-              <w:t xml:space="preserve"> web-based front-end.</w:t>
-            </w:r>
-          </w:p>
-          <w:p>
-            <w:pPr>
-              <w:pStyle w:val="ListParagraph"/>
-              <w:numPr>
-                <w:ilvl w:val="0"/>
-                <w:numId w:val="1"/>
-              </w:numPr>
-              <w:rPr>
-                <w:color w:val="230400"/>
-              </w:rPr>
-            </w:pPr>
-            <w:r>
-              <w:rPr>
-                <w:color w:val="230400"/>
-              </w:rPr>
-              <w:t>Lead</w:t>
-            </w:r>
-            <w:r>
-              <w:rPr>
-                <w:color w:val="230400"/>
-              </w:rPr>
-              <w:t xml:space="preserve"> on</w:t>
-            </w:r>
-            <w:r>
-              <w:rPr>
-                <w:color w:val="230400"/>
-              </w:rPr>
-              <w:t xml:space="preserve"> integration of a Version Control System </w:t>
-            </w:r>
-            <w:r>
-              <w:rPr>
-                <w:color w:val="230400"/>
-              </w:rPr>
-              <w:t xml:space="preserve">(Bitbucket) </w:t>
-            </w:r>
-            <w:r>
-              <w:rPr>
-                <w:color w:val="230400"/>
-              </w:rPr>
-              <w:t>into the team’s processes.</w:t>
+              <w:t>Sole</w:t>
+            </w:r>
+            <w:r>
+              <w:rPr>
+                <w:color w:val="230400"/>
+              </w:rPr>
+              <w:t xml:space="preserve"> developer on </w:t>
+            </w:r>
+            <w:r>
+              <w:rPr>
+                <w:color w:val="230400"/>
+              </w:rPr>
+              <w:t>OAPIUM, a self-built desktop application for managing Okta single sign-on users</w:t>
+            </w:r>
+            <w:r>
+              <w:rPr>
+                <w:color w:val="230400"/>
+              </w:rPr>
+              <w:t xml:space="preserve"> (</w:t>
+            </w:r>
+            <w:r>
+              <w:rPr>
+                <w:color w:val="230400"/>
+              </w:rPr>
+              <w:t>u</w:t>
+            </w:r>
+            <w:r>
+              <w:rPr>
+                <w:color w:val="230400"/>
+              </w:rPr>
+              <w:t>sing Electron, Chromium, Node.js, HTML/CSS/JavaScript)</w:t>
+            </w:r>
+            <w:r>
+              <w:rPr>
+                <w:color w:val="230400"/>
+              </w:rPr>
+              <w:t>, considerably</w:t>
+            </w:r>
+            <w:r>
+              <w:rPr>
+                <w:color w:val="230400"/>
+              </w:rPr>
+              <w:t xml:space="preserve"> </w:t>
+            </w:r>
+            <w:r>
+              <w:rPr>
+                <w:color w:val="230400"/>
+              </w:rPr>
+              <w:t>reducing</w:t>
+            </w:r>
+            <w:r>
+              <w:rPr>
+                <w:color w:val="230400"/>
+              </w:rPr>
+              <w:t xml:space="preserve"> manual overhead </w:t>
+            </w:r>
+            <w:r>
+              <w:rPr>
+                <w:color w:val="230400"/>
+              </w:rPr>
+              <w:t>of this process</w:t>
+            </w:r>
+            <w:r>
+              <w:rPr>
+                <w:color w:val="230400"/>
+              </w:rPr>
+              <w:t>.</w:t>
             </w:r>
           </w:p>
         </w:tc>
@@ -2696,93 +3081,6 @@
                 <w:color w:val="230400"/>
               </w:rPr>
             </w:pPr>
-            <w:bookmarkStart w:id="1" w:name="_Hlk165554510"/>
-            <w:bookmarkEnd w:id="0"/>
-          </w:p>
-        </w:tc>
-      </w:tr>
-      <w:bookmarkEnd w:id="1"/>
-      <w:tr>
-        <w:trPr>
-          <w:trHeight w:val="340"/>
-        </w:trPr>
-        <w:tc>
-          <w:tcPr>
-            <w:tcW w:w="5494" w:type="dxa"/>
-            <w:vAlign w:val="center"/>
-          </w:tcPr>
-          <w:p>
-            <w:pPr>
-              <w:rPr>
-                <w:b/>
-                <w:color w:val="230400"/>
-              </w:rPr>
-            </w:pPr>
-            <w:r>
-              <w:rPr>
-                <w:b/>
-                <w:color w:val="230400"/>
-              </w:rPr>
-              <w:t xml:space="preserve">WILMINGTON </w:t>
-            </w:r>
-            <w:r>
-              <w:rPr>
-                <w:b/>
-                <w:color w:val="230400"/>
-              </w:rPr>
-              <w:t>PLC</w:t>
-            </w:r>
-            <w:r>
-              <w:rPr>
-                <w:b/>
-                <w:color w:val="230400"/>
-              </w:rPr>
-              <w:t xml:space="preserve"> (HEALTHCARE)</w:t>
-            </w:r>
-          </w:p>
-        </w:tc>
-        <w:tc>
-          <w:tcPr>
-            <w:tcW w:w="5494" w:type="dxa"/>
-            <w:vAlign w:val="center"/>
-          </w:tcPr>
-          <w:p>
-            <w:pPr>
-              <w:jc w:val="right"/>
-              <w:rPr>
-                <w:color w:val="230400"/>
-              </w:rPr>
-            </w:pPr>
-            <w:r>
-              <w:rPr>
-                <w:color w:val="230400"/>
-              </w:rPr>
-              <w:t>Jul</w:t>
-            </w:r>
-            <w:r>
-              <w:rPr>
-                <w:color w:val="230400"/>
-              </w:rPr>
-              <w:t xml:space="preserve"> 2019 </w:t>
-            </w:r>
-            <w:r>
-              <w:rPr>
-                <w:color w:val="230400"/>
-              </w:rPr>
-              <w:t>–</w:t>
-            </w:r>
-            <w:r>
-              <w:rPr>
-                <w:color w:val="230400"/>
-              </w:rPr>
-              <w:t xml:space="preserve"> </w:t>
-            </w:r>
-            <w:r>
-              <w:rPr>
-                <w:color w:val="230400"/>
-              </w:rPr>
-              <w:t>Mar 2021</w:t>
-            </w:r>
           </w:p>
         </w:tc>
       </w:tr>
@@ -2792,250 +3090,55 @@
         </w:trPr>
         <w:tc>
           <w:tcPr>
-            <w:tcW w:w="10988" w:type="dxa"/>
-            <w:gridSpan w:val="2"/>
-            <w:vAlign w:val="center"/>
-          </w:tcPr>
-          <w:p>
-            <w:pPr>
-              <w:rPr>
-                <w:color w:val="230400"/>
-              </w:rPr>
-            </w:pPr>
-            <w:r>
-              <w:rPr>
-                <w:color w:val="230400"/>
-              </w:rPr>
-              <w:t>SQL Developer</w:t>
-            </w:r>
-            <w:r>
-              <w:rPr>
-                <w:color w:val="230400"/>
-              </w:rPr>
-              <w:br/>
-            </w:r>
-          </w:p>
-          <w:p>
-            <w:pPr>
-              <w:pStyle w:val="ListParagraph"/>
-              <w:numPr>
-                <w:ilvl w:val="0"/>
-                <w:numId w:val="1"/>
-              </w:numPr>
-              <w:rPr>
-                <w:color w:val="230400"/>
-              </w:rPr>
-            </w:pPr>
-            <w:r>
-              <w:rPr>
-                <w:color w:val="230400"/>
-              </w:rPr>
-              <w:t>Co-leading d</w:t>
-            </w:r>
-            <w:r>
-              <w:rPr>
-                <w:color w:val="230400"/>
-              </w:rPr>
-              <w:t xml:space="preserve">esign, </w:t>
-            </w:r>
-            <w:r>
-              <w:rPr>
-                <w:color w:val="230400"/>
-              </w:rPr>
-              <w:t>implementation,</w:t>
-            </w:r>
-            <w:r>
-              <w:rPr>
-                <w:color w:val="230400"/>
-              </w:rPr>
-              <w:t xml:space="preserve"> and maintenance of the business'</w:t>
-            </w:r>
-            <w:r>
-              <w:rPr>
-                <w:color w:val="230400"/>
-              </w:rPr>
-              <w:t>s</w:t>
-            </w:r>
-            <w:r>
-              <w:rPr>
-                <w:color w:val="230400"/>
-              </w:rPr>
-              <w:t xml:space="preserve"> </w:t>
-            </w:r>
-            <w:r>
-              <w:rPr>
-                <w:color w:val="230400"/>
-              </w:rPr>
-              <w:t xml:space="preserve">healthcare </w:t>
-            </w:r>
-            <w:r>
-              <w:rPr>
-                <w:color w:val="230400"/>
-              </w:rPr>
-              <w:t>data</w:t>
-            </w:r>
-            <w:r>
-              <w:rPr>
-                <w:color w:val="230400"/>
-              </w:rPr>
-              <w:t xml:space="preserve"> platform</w:t>
-            </w:r>
-            <w:r>
-              <w:rPr>
-                <w:color w:val="230400"/>
-              </w:rPr>
-              <w:t>.</w:t>
-            </w:r>
-          </w:p>
-          <w:p>
-            <w:pPr>
-              <w:pStyle w:val="ListParagraph"/>
-              <w:numPr>
-                <w:ilvl w:val="0"/>
-                <w:numId w:val="1"/>
-              </w:numPr>
-              <w:rPr>
-                <w:color w:val="230400"/>
-              </w:rPr>
-            </w:pPr>
-            <w:r>
-              <w:rPr>
-                <w:color w:val="230400"/>
-              </w:rPr>
-              <w:t>Supporting the above by using tools and software</w:t>
-            </w:r>
-            <w:r>
-              <w:rPr>
-                <w:color w:val="230400"/>
-              </w:rPr>
-              <w:t>,</w:t>
-            </w:r>
-            <w:r>
-              <w:rPr>
-                <w:color w:val="230400"/>
-              </w:rPr>
-              <w:t xml:space="preserve"> including Tableau, Git, </w:t>
-            </w:r>
-            <w:r>
-              <w:rPr>
-                <w:color w:val="230400"/>
-              </w:rPr>
-              <w:t>GitHub,</w:t>
-            </w:r>
-            <w:r>
-              <w:rPr>
-                <w:color w:val="230400"/>
-              </w:rPr>
-              <w:t xml:space="preserve"> and Visual Studio Code.</w:t>
-            </w:r>
-          </w:p>
-          <w:p>
-            <w:pPr>
-              <w:pStyle w:val="ListParagraph"/>
-              <w:numPr>
-                <w:ilvl w:val="0"/>
-                <w:numId w:val="1"/>
-              </w:numPr>
-              <w:rPr>
-                <w:color w:val="230400"/>
-              </w:rPr>
-            </w:pPr>
-            <w:r>
-              <w:rPr>
-                <w:color w:val="230400"/>
-              </w:rPr>
-              <w:t>Sole</w:t>
-            </w:r>
-            <w:r>
-              <w:rPr>
-                <w:color w:val="230400"/>
-              </w:rPr>
-              <w:t xml:space="preserve"> developer on </w:t>
-            </w:r>
-            <w:r>
-              <w:rPr>
-                <w:color w:val="230400"/>
-              </w:rPr>
-              <w:t>OAPIUM, a self-built desktop application for managing Okta single sign-on users</w:t>
-            </w:r>
-            <w:r>
-              <w:rPr>
-                <w:color w:val="230400"/>
-              </w:rPr>
-              <w:t xml:space="preserve"> (</w:t>
-            </w:r>
-            <w:r>
-              <w:rPr>
-                <w:color w:val="230400"/>
-              </w:rPr>
-              <w:t>u</w:t>
-            </w:r>
-            <w:r>
-              <w:rPr>
-                <w:color w:val="230400"/>
-              </w:rPr>
-              <w:t>sing Electron, Chromium, Node.js, HTML/CSS/JavaScript)</w:t>
-            </w:r>
-            <w:r>
-              <w:rPr>
-                <w:color w:val="230400"/>
-              </w:rPr>
-              <w:t>, considerably</w:t>
-            </w:r>
-            <w:r>
-              <w:rPr>
-                <w:color w:val="230400"/>
-              </w:rPr>
-              <w:t xml:space="preserve"> </w:t>
-            </w:r>
-            <w:r>
-              <w:rPr>
-                <w:color w:val="230400"/>
-              </w:rPr>
-              <w:t>reducing</w:t>
-            </w:r>
-            <w:r>
-              <w:rPr>
-                <w:color w:val="230400"/>
-              </w:rPr>
-              <w:t xml:space="preserve"> manual overhead </w:t>
-            </w:r>
-            <w:r>
-              <w:rPr>
-                <w:color w:val="230400"/>
-              </w:rPr>
-              <w:t>of this process</w:t>
-            </w:r>
-            <w:r>
-              <w:rPr>
-                <w:color w:val="230400"/>
-              </w:rPr>
-              <w:t>.</w:t>
-            </w:r>
-          </w:p>
-          <w:p>
-            <w:pPr>
-              <w:pStyle w:val="ListParagraph"/>
-              <w:numPr>
-                <w:ilvl w:val="0"/>
-                <w:numId w:val="1"/>
-              </w:numPr>
-              <w:rPr>
-                <w:color w:val="230400"/>
-              </w:rPr>
-            </w:pPr>
-            <w:r>
-              <w:rPr>
-                <w:color w:val="230400"/>
-              </w:rPr>
-              <w:t>Processing and anonymising sensitive healthcare information, including data from NHS Digital.</w:t>
+            <w:tcW w:w="5494" w:type="dxa"/>
+            <w:vAlign w:val="center"/>
+          </w:tcPr>
+          <w:p>
+            <w:pPr>
+              <w:rPr>
+                <w:b/>
+                <w:color w:val="230400"/>
+              </w:rPr>
+            </w:pPr>
+            <w:r>
+              <w:rPr>
+                <w:b/>
+                <w:color w:val="230400"/>
+              </w:rPr>
+              <w:t>SKIPTON BUILDING SOCIETY</w:t>
+            </w:r>
+          </w:p>
+        </w:tc>
+        <w:tc>
+          <w:tcPr>
+            <w:tcW w:w="5494" w:type="dxa"/>
+            <w:vAlign w:val="center"/>
+          </w:tcPr>
+          <w:p>
+            <w:pPr>
+              <w:jc w:val="right"/>
+              <w:rPr>
+                <w:color w:val="230400"/>
+              </w:rPr>
+            </w:pPr>
+            <w:r>
+              <w:rPr>
+                <w:color w:val="230400"/>
+              </w:rPr>
+              <w:t>Sep 2015 – Apr</w:t>
+            </w:r>
+            <w:r>
+              <w:rPr>
+                <w:color w:val="230400"/>
+              </w:rPr>
+              <w:t xml:space="preserve"> 2019</w:t>
             </w:r>
           </w:p>
         </w:tc>
       </w:tr>
       <w:tr>
         <w:trPr>
-          <w:trHeight w:val="340"/>
+          <w:trHeight w:val="372"/>
         </w:trPr>
         <w:tc>
           <w:tcPr>
@@ -3049,352 +3152,11 @@
                 <w:color w:val="230400"/>
               </w:rPr>
             </w:pPr>
-          </w:p>
-        </w:tc>
-      </w:tr>
-      <w:tr>
-        <w:trPr>
-          <w:trHeight w:val="340"/>
-        </w:trPr>
-        <w:tc>
-          <w:tcPr>
-            <w:tcW w:w="5494" w:type="dxa"/>
-            <w:vAlign w:val="center"/>
-          </w:tcPr>
-          <w:p>
-            <w:pPr>
-              <w:rPr>
-                <w:b/>
-                <w:color w:val="230400"/>
-              </w:rPr>
-            </w:pPr>
-            <w:r>
-              <w:rPr>
-                <w:b/>
-                <w:color w:val="230400"/>
-              </w:rPr>
-              <w:t>SKIPTON BUILDING SOCIETY</w:t>
-            </w:r>
-          </w:p>
-        </w:tc>
-        <w:tc>
-          <w:tcPr>
-            <w:tcW w:w="5494" w:type="dxa"/>
-            <w:vAlign w:val="center"/>
-          </w:tcPr>
-          <w:p>
-            <w:pPr>
-              <w:jc w:val="right"/>
-              <w:rPr>
-                <w:color w:val="230400"/>
-              </w:rPr>
-            </w:pPr>
-            <w:r>
-              <w:rPr>
-                <w:color w:val="230400"/>
-              </w:rPr>
-              <w:t>Sep 2015 – Apr</w:t>
-            </w:r>
-            <w:r>
-              <w:rPr>
-                <w:color w:val="230400"/>
-              </w:rPr>
-              <w:t xml:space="preserve"> 2019</w:t>
-            </w:r>
-          </w:p>
-        </w:tc>
-      </w:tr>
-      <w:tr>
-        <w:trPr>
-          <w:trHeight w:val="1460"/>
-        </w:trPr>
-        <w:tc>
-          <w:tcPr>
-            <w:tcW w:w="10988" w:type="dxa"/>
-            <w:gridSpan w:val="2"/>
-            <w:vAlign w:val="center"/>
-          </w:tcPr>
-          <w:p>
-            <w:pPr>
-              <w:rPr>
-                <w:color w:val="230400"/>
-              </w:rPr>
-            </w:pPr>
             <w:r>
               <w:rPr>
                 <w:color w:val="230400"/>
               </w:rPr>
               <w:t>Business Intelligence (BI) Specialist</w:t>
-            </w:r>
-            <w:r>
-              <w:rPr>
-                <w:color w:val="230400"/>
-              </w:rPr>
-              <w:br/>
-            </w:r>
-          </w:p>
-          <w:p>
-            <w:pPr>
-              <w:pStyle w:val="ListParagraph"/>
-              <w:numPr>
-                <w:ilvl w:val="0"/>
-                <w:numId w:val="1"/>
-              </w:numPr>
-              <w:rPr>
-                <w:color w:val="230400"/>
-              </w:rPr>
-            </w:pPr>
-            <w:r>
-              <w:rPr>
-                <w:color w:val="230400"/>
-              </w:rPr>
-              <w:t>Design</w:t>
-            </w:r>
-            <w:r>
-              <w:rPr>
-                <w:color w:val="230400"/>
-              </w:rPr>
-              <w:t>ing</w:t>
-            </w:r>
-            <w:r>
-              <w:rPr>
-                <w:color w:val="230400"/>
-              </w:rPr>
-              <w:t xml:space="preserve">, </w:t>
-            </w:r>
-            <w:r>
-              <w:rPr>
-                <w:color w:val="230400"/>
-              </w:rPr>
-              <w:t>implement</w:t>
-            </w:r>
-            <w:r>
-              <w:rPr>
-                <w:color w:val="230400"/>
-              </w:rPr>
-              <w:t>ing</w:t>
-            </w:r>
-            <w:r>
-              <w:rPr>
-                <w:color w:val="230400"/>
-              </w:rPr>
-              <w:t>,</w:t>
-            </w:r>
-            <w:r>
-              <w:rPr>
-                <w:color w:val="230400"/>
-              </w:rPr>
-              <w:t xml:space="preserve"> and maint</w:t>
-            </w:r>
-            <w:r>
-              <w:rPr>
-                <w:color w:val="230400"/>
-              </w:rPr>
-              <w:t>aining</w:t>
-            </w:r>
-            <w:r>
-              <w:rPr>
-                <w:color w:val="230400"/>
-              </w:rPr>
-              <w:t xml:space="preserve"> the business'</w:t>
-            </w:r>
-            <w:r>
-              <w:rPr>
-                <w:color w:val="230400"/>
-              </w:rPr>
-              <w:t>s</w:t>
-            </w:r>
-            <w:r>
-              <w:rPr>
-                <w:color w:val="230400"/>
-              </w:rPr>
-              <w:t xml:space="preserve"> Operational Data Store (ODS) and Data Warehouse</w:t>
-            </w:r>
-            <w:r>
-              <w:rPr>
-                <w:color w:val="230400"/>
-              </w:rPr>
-              <w:t xml:space="preserve"> (DW)</w:t>
-            </w:r>
-            <w:r>
-              <w:rPr>
-                <w:color w:val="230400"/>
-              </w:rPr>
-              <w:t>.</w:t>
-            </w:r>
-          </w:p>
-          <w:p>
-            <w:pPr>
-              <w:pStyle w:val="ListParagraph"/>
-              <w:numPr>
-                <w:ilvl w:val="0"/>
-                <w:numId w:val="1"/>
-              </w:numPr>
-              <w:rPr>
-                <w:color w:val="230400"/>
-              </w:rPr>
-            </w:pPr>
-            <w:r>
-              <w:rPr>
-                <w:color w:val="230400"/>
-              </w:rPr>
-              <w:t>Creat</w:t>
-            </w:r>
-            <w:r>
-              <w:rPr>
-                <w:color w:val="230400"/>
-              </w:rPr>
-              <w:t>ing and maintaining</w:t>
-            </w:r>
-            <w:r>
-              <w:rPr>
-                <w:color w:val="230400"/>
-              </w:rPr>
-              <w:t xml:space="preserve"> SSIS packages to </w:t>
-            </w:r>
-            <w:r>
-              <w:rPr>
-                <w:color w:val="230400"/>
-              </w:rPr>
-              <w:t>move data through the above</w:t>
-            </w:r>
-            <w:r>
-              <w:rPr>
-                <w:color w:val="230400"/>
-              </w:rPr>
-              <w:t>.</w:t>
-            </w:r>
-          </w:p>
-          <w:p>
-            <w:pPr>
-              <w:pStyle w:val="ListParagraph"/>
-              <w:numPr>
-                <w:ilvl w:val="0"/>
-                <w:numId w:val="1"/>
-              </w:numPr>
-              <w:rPr>
-                <w:color w:val="230400"/>
-              </w:rPr>
-            </w:pPr>
-            <w:r>
-              <w:rPr>
-                <w:color w:val="230400"/>
-              </w:rPr>
-              <w:t>Promoti</w:t>
-            </w:r>
-            <w:r>
-              <w:rPr>
-                <w:color w:val="230400"/>
-              </w:rPr>
-              <w:t xml:space="preserve">ng </w:t>
-            </w:r>
-            <w:r>
-              <w:rPr>
-                <w:color w:val="230400"/>
-              </w:rPr>
-              <w:t>code through different environments (</w:t>
-            </w:r>
-            <w:r>
-              <w:rPr>
-                <w:color w:val="230400"/>
-              </w:rPr>
-              <w:t>i.e.,</w:t>
-            </w:r>
-            <w:r>
-              <w:rPr>
-                <w:color w:val="230400"/>
-              </w:rPr>
-              <w:t xml:space="preserve"> Test/UAT/Pre-Production/Production) through Source Control.</w:t>
-            </w:r>
-          </w:p>
-          <w:p>
-            <w:pPr>
-              <w:pStyle w:val="ListParagraph"/>
-              <w:numPr>
-                <w:ilvl w:val="0"/>
-                <w:numId w:val="1"/>
-              </w:numPr>
-              <w:rPr>
-                <w:color w:val="230400"/>
-              </w:rPr>
-            </w:pPr>
-            <w:r>
-              <w:rPr>
-                <w:color w:val="230400"/>
-              </w:rPr>
-              <w:t xml:space="preserve">Performing systems </w:t>
-            </w:r>
-            <w:r>
-              <w:rPr>
-                <w:color w:val="230400"/>
-              </w:rPr>
-              <w:t xml:space="preserve">testing on solutions and reporting defects through </w:t>
-            </w:r>
-            <w:r>
-              <w:rPr>
-                <w:color w:val="230400"/>
-              </w:rPr>
-              <w:t>ticketing system</w:t>
-            </w:r>
-            <w:r>
-              <w:rPr>
-                <w:color w:val="230400"/>
-              </w:rPr>
-              <w:t xml:space="preserve"> (TFS 2012).</w:t>
-            </w:r>
-          </w:p>
-          <w:p>
-            <w:pPr>
-              <w:pStyle w:val="ListParagraph"/>
-              <w:numPr>
-                <w:ilvl w:val="0"/>
-                <w:numId w:val="1"/>
-              </w:numPr>
-              <w:rPr>
-                <w:color w:val="230400"/>
-              </w:rPr>
-            </w:pPr>
-            <w:r>
-              <w:rPr>
-                <w:color w:val="230400"/>
-              </w:rPr>
-              <w:t>Building reporting solutions using</w:t>
-            </w:r>
-            <w:r>
-              <w:rPr>
-                <w:color w:val="230400"/>
-              </w:rPr>
-              <w:t xml:space="preserve"> SQL Serve</w:t>
-            </w:r>
-            <w:r>
-              <w:rPr>
-                <w:color w:val="230400"/>
-              </w:rPr>
-              <w:t>r Reporting Services</w:t>
-            </w:r>
-            <w:r>
-              <w:rPr>
-                <w:color w:val="230400"/>
-              </w:rPr>
-              <w:t xml:space="preserve"> (SSRS)</w:t>
-            </w:r>
-            <w:r>
-              <w:rPr>
-                <w:color w:val="230400"/>
-              </w:rPr>
-              <w:t>, Report Builder</w:t>
-            </w:r>
-            <w:r>
-              <w:rPr>
-                <w:color w:val="230400"/>
-              </w:rPr>
-              <w:t>, SharePoint l</w:t>
-            </w:r>
-            <w:r>
-              <w:rPr>
-                <w:color w:val="230400"/>
-              </w:rPr>
-              <w:t>ists and Excel.</w:t>
             </w:r>
           </w:p>
         </w:tc>
@@ -4596,17 +4358,17 @@
   <w:abstractNum w:abstractNumId="0" w15:restartNumberingAfterBreak="0">
     <w:nsid w:val="13974BFE"/>
     <w:multiLevelType w:val="hybridMultilevel"/>
-    <w:tmpl w:val="D8F25C66"/>
-    <w:lvl w:ilvl="0" w:tplc="D13ED090">
+    <w:tmpl w:val="6B9841EA"/>
+    <w:lvl w:ilvl="0" w:tplc="81CC0502">
       <w:start w:val="1"/>
       <w:numFmt w:val="bullet"/>
-      <w:lvlText w:val="̶"/>
-      <w:lvlJc w:val="right"/>
+      <w:lvlText w:val="-"/>
+      <w:lvlJc w:val="left"/>
       <w:pPr>
         <w:ind w:left="720" w:hanging="360"/>
       </w:pPr>
       <w:rPr>
-        <w:rFonts w:ascii="Tahoma" w:hAnsi="Tahoma" w:hint="default"/>
+        <w:rFonts w:ascii="Tahoma" w:eastAsiaTheme="minorEastAsia" w:hAnsi="Tahoma" w:cs="Tahoma" w:hint="default"/>
       </w:rPr>
     </w:lvl>
     <w:lvl w:ilvl="1" w:tplc="08090003">

</xml_diff>